<commit_message>
New Command - SizeOf. Explained in the changelog30+.docx.
</commit_message>
<xml_diff>
--- a/changelog30+.docx
+++ b/changelog30+.docx
@@ -12,23 +12,13 @@
           <w:sz w:val="48"/>
         </w:rPr>
       </w:pPr>
-      <w:proofErr w:type="spellStart"/>
       <w:r>
         <w:rPr>
           <w:rFonts w:ascii="Verdana" w:hAnsi="Verdana"/>
           <w:b/>
           <w:sz w:val="48"/>
         </w:rPr>
-        <w:t>Ermac</w:t>
-      </w:r>
-      <w:proofErr w:type="spellEnd"/>
-      <w:r>
-        <w:rPr>
-          <w:rFonts w:ascii="Verdana" w:hAnsi="Verdana"/>
-          <w:b/>
-          <w:sz w:val="48"/>
-        </w:rPr>
-        <w:t xml:space="preserve"> Voxel Game v </w:t>
+        <w:t xml:space="preserve">Ermac Voxel Game v </w:t>
       </w:r>
       <w:r>
         <w:rPr>
@@ -254,8 +244,8 @@
         <w:ind w:left="360"/>
         <w:rPr>
           <w:rFonts w:ascii="Verdana" w:hAnsi="Verdana"/>
-          <w:b/>
-          <w:sz w:val="48"/>
+          <w:sz w:val="32"/>
+          <w:szCs w:val="32"/>
         </w:rPr>
       </w:pPr>
       <w:r>
@@ -265,6 +255,44 @@
           <w:szCs w:val="32"/>
         </w:rPr>
         <w:t>SET Current Position OR SET Chunk)</w:t>
+      </w:r>
+      <w:r>
+        <w:rPr>
+          <w:rFonts w:ascii="Verdana" w:hAnsi="Verdana"/>
+          <w:sz w:val="32"/>
+          <w:szCs w:val="32"/>
+        </w:rPr>
+        <w:t>.</w:t>
+      </w:r>
+    </w:p>
+    <w:p>
+      <w:pPr>
+        <w:pStyle w:val="NoSpacing"/>
+        <w:numPr>
+          <w:ilvl w:val="0"/>
+          <w:numId w:val="27"/>
+        </w:numPr>
+        <w:rPr>
+          <w:rFonts w:ascii="Verdana" w:hAnsi="Verdana"/>
+          <w:sz w:val="32"/>
+          <w:szCs w:val="32"/>
+        </w:rPr>
+      </w:pPr>
+      <w:r>
+        <w:rPr>
+          <w:rFonts w:ascii="Verdana" w:hAnsi="Verdana"/>
+          <w:sz w:val="32"/>
+          <w:szCs w:val="32"/>
+        </w:rPr>
+        <w:t>SizeOf command - without arguments provides total size and with chunk argument id provides size of blocks inside chunk</w:t>
+      </w:r>
+      <w:r>
+        <w:rPr>
+          <w:rFonts w:ascii="Verdana" w:hAnsi="Verdana"/>
+          <w:sz w:val="32"/>
+          <w:szCs w:val="32"/>
+        </w:rPr>
+        <w:t xml:space="preserve"> (available only as GET)</w:t>
       </w:r>
       <w:r>
         <w:rPr>
@@ -691,59 +719,13 @@
             <w:szCs w:val="32"/>
           </w:rPr>
         </w:pPr>
-        <w:proofErr w:type="spellStart"/>
         <w:r>
           <w:rPr>
             <w:rFonts w:ascii="Verdana" w:hAnsi="Verdana"/>
             <w:sz w:val="24"/>
             <w:szCs w:val="32"/>
           </w:rPr>
-          <w:t>Ermac</w:t>
-        </w:r>
-        <w:proofErr w:type="spellEnd"/>
-        <w:r>
-          <w:rPr>
-            <w:rFonts w:ascii="Verdana" w:hAnsi="Verdana"/>
-            <w:sz w:val="24"/>
-            <w:szCs w:val="32"/>
-          </w:rPr>
-          <w:t xml:space="preserve"> Voxel Game - Alexander “</w:t>
-        </w:r>
-        <w:proofErr w:type="spellStart"/>
-        <w:r>
-          <w:rPr>
-            <w:rFonts w:ascii="Verdana" w:hAnsi="Verdana"/>
-            <w:sz w:val="24"/>
-            <w:szCs w:val="32"/>
-          </w:rPr>
-          <w:t>Ermac</w:t>
-        </w:r>
-        <w:proofErr w:type="spellEnd"/>
-        <w:r>
-          <w:rPr>
-            <w:rFonts w:ascii="Verdana" w:hAnsi="Verdana"/>
-            <w:sz w:val="24"/>
-            <w:szCs w:val="32"/>
-          </w:rPr>
-          <w:t xml:space="preserve">” </w:t>
-        </w:r>
-        <w:proofErr w:type="spellStart"/>
-        <w:r>
-          <w:rPr>
-            <w:rFonts w:ascii="Verdana" w:hAnsi="Verdana"/>
-            <w:sz w:val="24"/>
-            <w:szCs w:val="32"/>
-          </w:rPr>
-          <w:t>Stojanovich</w:t>
-        </w:r>
-        <w:proofErr w:type="spellEnd"/>
-        <w:r>
-          <w:rPr>
-            <w:rFonts w:ascii="Verdana" w:hAnsi="Verdana"/>
-            <w:sz w:val="24"/>
-            <w:szCs w:val="32"/>
-          </w:rPr>
-          <w:t xml:space="preserve">, </w:t>
+          <w:t xml:space="preserve">Ermac Voxel Game - Alexander “Ermac” Stojanovich, </w:t>
         </w:r>
         <w:r>
           <w:rPr>
@@ -1574,6 +1556,119 @@
     </w:lvl>
   </w:abstractNum>
   <w:abstractNum w:abstractNumId="7" w15:restartNumberingAfterBreak="0">
+    <w:nsid w:val="262F00A3"/>
+    <w:multiLevelType w:val="hybridMultilevel"/>
+    <w:tmpl w:val="1CAC4392"/>
+    <w:lvl w:ilvl="0" w:tplc="04090001">
+      <w:start w:val="1"/>
+      <w:numFmt w:val="bullet"/>
+      <w:lvlText w:val=""/>
+      <w:lvlJc w:val="left"/>
+      <w:pPr>
+        <w:ind w:left="360" w:hanging="360"/>
+      </w:pPr>
+      <w:rPr>
+        <w:rFonts w:ascii="Symbol" w:hAnsi="Symbol" w:hint="default"/>
+      </w:rPr>
+    </w:lvl>
+    <w:lvl w:ilvl="1" w:tplc="04090003" w:tentative="1">
+      <w:start w:val="1"/>
+      <w:numFmt w:val="bullet"/>
+      <w:lvlText w:val="o"/>
+      <w:lvlJc w:val="left"/>
+      <w:pPr>
+        <w:ind w:left="1080" w:hanging="360"/>
+      </w:pPr>
+      <w:rPr>
+        <w:rFonts w:ascii="Courier New" w:hAnsi="Courier New" w:cs="Courier New" w:hint="default"/>
+      </w:rPr>
+    </w:lvl>
+    <w:lvl w:ilvl="2" w:tplc="04090005" w:tentative="1">
+      <w:start w:val="1"/>
+      <w:numFmt w:val="bullet"/>
+      <w:lvlText w:val=""/>
+      <w:lvlJc w:val="left"/>
+      <w:pPr>
+        <w:ind w:left="1800" w:hanging="360"/>
+      </w:pPr>
+      <w:rPr>
+        <w:rFonts w:ascii="Wingdings" w:hAnsi="Wingdings" w:hint="default"/>
+      </w:rPr>
+    </w:lvl>
+    <w:lvl w:ilvl="3" w:tplc="04090001" w:tentative="1">
+      <w:start w:val="1"/>
+      <w:numFmt w:val="bullet"/>
+      <w:lvlText w:val=""/>
+      <w:lvlJc w:val="left"/>
+      <w:pPr>
+        <w:ind w:left="2520" w:hanging="360"/>
+      </w:pPr>
+      <w:rPr>
+        <w:rFonts w:ascii="Symbol" w:hAnsi="Symbol" w:hint="default"/>
+      </w:rPr>
+    </w:lvl>
+    <w:lvl w:ilvl="4" w:tplc="04090003" w:tentative="1">
+      <w:start w:val="1"/>
+      <w:numFmt w:val="bullet"/>
+      <w:lvlText w:val="o"/>
+      <w:lvlJc w:val="left"/>
+      <w:pPr>
+        <w:ind w:left="3240" w:hanging="360"/>
+      </w:pPr>
+      <w:rPr>
+        <w:rFonts w:ascii="Courier New" w:hAnsi="Courier New" w:cs="Courier New" w:hint="default"/>
+      </w:rPr>
+    </w:lvl>
+    <w:lvl w:ilvl="5" w:tplc="04090005" w:tentative="1">
+      <w:start w:val="1"/>
+      <w:numFmt w:val="bullet"/>
+      <w:lvlText w:val=""/>
+      <w:lvlJc w:val="left"/>
+      <w:pPr>
+        <w:ind w:left="3960" w:hanging="360"/>
+      </w:pPr>
+      <w:rPr>
+        <w:rFonts w:ascii="Wingdings" w:hAnsi="Wingdings" w:hint="default"/>
+      </w:rPr>
+    </w:lvl>
+    <w:lvl w:ilvl="6" w:tplc="04090001" w:tentative="1">
+      <w:start w:val="1"/>
+      <w:numFmt w:val="bullet"/>
+      <w:lvlText w:val=""/>
+      <w:lvlJc w:val="left"/>
+      <w:pPr>
+        <w:ind w:left="4680" w:hanging="360"/>
+      </w:pPr>
+      <w:rPr>
+        <w:rFonts w:ascii="Symbol" w:hAnsi="Symbol" w:hint="default"/>
+      </w:rPr>
+    </w:lvl>
+    <w:lvl w:ilvl="7" w:tplc="04090003" w:tentative="1">
+      <w:start w:val="1"/>
+      <w:numFmt w:val="bullet"/>
+      <w:lvlText w:val="o"/>
+      <w:lvlJc w:val="left"/>
+      <w:pPr>
+        <w:ind w:left="5400" w:hanging="360"/>
+      </w:pPr>
+      <w:rPr>
+        <w:rFonts w:ascii="Courier New" w:hAnsi="Courier New" w:cs="Courier New" w:hint="default"/>
+      </w:rPr>
+    </w:lvl>
+    <w:lvl w:ilvl="8" w:tplc="04090005" w:tentative="1">
+      <w:start w:val="1"/>
+      <w:numFmt w:val="bullet"/>
+      <w:lvlText w:val=""/>
+      <w:lvlJc w:val="left"/>
+      <w:pPr>
+        <w:ind w:left="6120" w:hanging="360"/>
+      </w:pPr>
+      <w:rPr>
+        <w:rFonts w:ascii="Wingdings" w:hAnsi="Wingdings" w:hint="default"/>
+      </w:rPr>
+    </w:lvl>
+  </w:abstractNum>
+  <w:abstractNum w:abstractNumId="8" w15:restartNumberingAfterBreak="0">
     <w:nsid w:val="2E77476A"/>
     <w:multiLevelType w:val="hybridMultilevel"/>
     <w:tmpl w:val="694C00BE"/>
@@ -1688,7 +1783,7 @@
       </w:rPr>
     </w:lvl>
   </w:abstractNum>
-  <w:abstractNum w:abstractNumId="8" w15:restartNumberingAfterBreak="0">
+  <w:abstractNum w:abstractNumId="9" w15:restartNumberingAfterBreak="0">
     <w:nsid w:val="2F63198A"/>
     <w:multiLevelType w:val="hybridMultilevel"/>
     <w:tmpl w:val="8CBEE520"/>
@@ -1801,7 +1896,7 @@
       </w:rPr>
     </w:lvl>
   </w:abstractNum>
-  <w:abstractNum w:abstractNumId="9" w15:restartNumberingAfterBreak="0">
+  <w:abstractNum w:abstractNumId="10" w15:restartNumberingAfterBreak="0">
     <w:nsid w:val="2FA0400E"/>
     <w:multiLevelType w:val="hybridMultilevel"/>
     <w:tmpl w:val="166A2ED0"/>
@@ -1914,7 +2009,7 @@
       </w:rPr>
     </w:lvl>
   </w:abstractNum>
-  <w:abstractNum w:abstractNumId="10" w15:restartNumberingAfterBreak="0">
+  <w:abstractNum w:abstractNumId="11" w15:restartNumberingAfterBreak="0">
     <w:nsid w:val="31C4647D"/>
     <w:multiLevelType w:val="hybridMultilevel"/>
     <w:tmpl w:val="C250244E"/>
@@ -2027,7 +2122,7 @@
       </w:rPr>
     </w:lvl>
   </w:abstractNum>
-  <w:abstractNum w:abstractNumId="11" w15:restartNumberingAfterBreak="0">
+  <w:abstractNum w:abstractNumId="12" w15:restartNumberingAfterBreak="0">
     <w:nsid w:val="3A8E1F14"/>
     <w:multiLevelType w:val="hybridMultilevel"/>
     <w:tmpl w:val="DF8A4E4C"/>
@@ -2140,7 +2235,7 @@
       </w:rPr>
     </w:lvl>
   </w:abstractNum>
-  <w:abstractNum w:abstractNumId="12" w15:restartNumberingAfterBreak="0">
+  <w:abstractNum w:abstractNumId="13" w15:restartNumberingAfterBreak="0">
     <w:nsid w:val="47BB246C"/>
     <w:multiLevelType w:val="hybridMultilevel"/>
     <w:tmpl w:val="46048FB8"/>
@@ -2254,7 +2349,7 @@
       </w:rPr>
     </w:lvl>
   </w:abstractNum>
-  <w:abstractNum w:abstractNumId="13" w15:restartNumberingAfterBreak="0">
+  <w:abstractNum w:abstractNumId="14" w15:restartNumberingAfterBreak="0">
     <w:nsid w:val="49BD1D98"/>
     <w:multiLevelType w:val="hybridMultilevel"/>
     <w:tmpl w:val="3332526C"/>
@@ -2367,7 +2462,7 @@
       </w:rPr>
     </w:lvl>
   </w:abstractNum>
-  <w:abstractNum w:abstractNumId="14" w15:restartNumberingAfterBreak="0">
+  <w:abstractNum w:abstractNumId="15" w15:restartNumberingAfterBreak="0">
     <w:nsid w:val="4CBE58AB"/>
     <w:multiLevelType w:val="hybridMultilevel"/>
     <w:tmpl w:val="F7484EBC"/>
@@ -2481,7 +2576,7 @@
       </w:rPr>
     </w:lvl>
   </w:abstractNum>
-  <w:abstractNum w:abstractNumId="15" w15:restartNumberingAfterBreak="0">
+  <w:abstractNum w:abstractNumId="16" w15:restartNumberingAfterBreak="0">
     <w:nsid w:val="4DFC1534"/>
     <w:multiLevelType w:val="hybridMultilevel"/>
     <w:tmpl w:val="2EF85536"/>
@@ -2594,7 +2689,7 @@
       </w:rPr>
     </w:lvl>
   </w:abstractNum>
-  <w:abstractNum w:abstractNumId="16" w15:restartNumberingAfterBreak="0">
+  <w:abstractNum w:abstractNumId="17" w15:restartNumberingAfterBreak="0">
     <w:nsid w:val="511F51B9"/>
     <w:multiLevelType w:val="hybridMultilevel"/>
     <w:tmpl w:val="F650FDA2"/>
@@ -2707,7 +2802,7 @@
       </w:rPr>
     </w:lvl>
   </w:abstractNum>
-  <w:abstractNum w:abstractNumId="17" w15:restartNumberingAfterBreak="0">
+  <w:abstractNum w:abstractNumId="18" w15:restartNumberingAfterBreak="0">
     <w:nsid w:val="567B01C4"/>
     <w:multiLevelType w:val="hybridMultilevel"/>
     <w:tmpl w:val="01E64DBC"/>
@@ -2821,7 +2916,7 @@
       </w:rPr>
     </w:lvl>
   </w:abstractNum>
-  <w:abstractNum w:abstractNumId="18" w15:restartNumberingAfterBreak="0">
+  <w:abstractNum w:abstractNumId="19" w15:restartNumberingAfterBreak="0">
     <w:nsid w:val="57FA5BDC"/>
     <w:multiLevelType w:val="hybridMultilevel"/>
     <w:tmpl w:val="C1069388"/>
@@ -2934,7 +3029,7 @@
       </w:rPr>
     </w:lvl>
   </w:abstractNum>
-  <w:abstractNum w:abstractNumId="19" w15:restartNumberingAfterBreak="0">
+  <w:abstractNum w:abstractNumId="20" w15:restartNumberingAfterBreak="0">
     <w:nsid w:val="6A465EA9"/>
     <w:multiLevelType w:val="hybridMultilevel"/>
     <w:tmpl w:val="83527182"/>
@@ -3047,7 +3142,7 @@
       </w:rPr>
     </w:lvl>
   </w:abstractNum>
-  <w:abstractNum w:abstractNumId="20" w15:restartNumberingAfterBreak="0">
+  <w:abstractNum w:abstractNumId="21" w15:restartNumberingAfterBreak="0">
     <w:nsid w:val="6E0F0971"/>
     <w:multiLevelType w:val="hybridMultilevel"/>
     <w:tmpl w:val="EF481D2C"/>
@@ -3161,7 +3256,7 @@
       </w:rPr>
     </w:lvl>
   </w:abstractNum>
-  <w:abstractNum w:abstractNumId="21" w15:restartNumberingAfterBreak="0">
+  <w:abstractNum w:abstractNumId="22" w15:restartNumberingAfterBreak="0">
     <w:nsid w:val="74E724D3"/>
     <w:multiLevelType w:val="hybridMultilevel"/>
     <w:tmpl w:val="EDCC46EC"/>
@@ -3274,7 +3369,7 @@
       </w:rPr>
     </w:lvl>
   </w:abstractNum>
-  <w:abstractNum w:abstractNumId="22" w15:restartNumberingAfterBreak="0">
+  <w:abstractNum w:abstractNumId="23" w15:restartNumberingAfterBreak="0">
     <w:nsid w:val="774E37A9"/>
     <w:multiLevelType w:val="hybridMultilevel"/>
     <w:tmpl w:val="1E341DC4"/>
@@ -3387,7 +3482,7 @@
       </w:rPr>
     </w:lvl>
   </w:abstractNum>
-  <w:abstractNum w:abstractNumId="23" w15:restartNumberingAfterBreak="0">
+  <w:abstractNum w:abstractNumId="24" w15:restartNumberingAfterBreak="0">
     <w:nsid w:val="7C7B411A"/>
     <w:multiLevelType w:val="hybridMultilevel"/>
     <w:tmpl w:val="DD327E98"/>
@@ -3501,16 +3596,16 @@
     </w:lvl>
   </w:abstractNum>
   <w:num w:numId="1" w16cid:durableId="1126509980">
-    <w:abstractNumId w:val="21"/>
+    <w:abstractNumId w:val="22"/>
   </w:num>
   <w:num w:numId="2" w16cid:durableId="1990354778">
-    <w:abstractNumId w:val="18"/>
+    <w:abstractNumId w:val="19"/>
   </w:num>
   <w:num w:numId="3" w16cid:durableId="1972325749">
-    <w:abstractNumId w:val="15"/>
+    <w:abstractNumId w:val="16"/>
   </w:num>
   <w:num w:numId="4" w16cid:durableId="1152988680">
-    <w:abstractNumId w:val="8"/>
+    <w:abstractNumId w:val="9"/>
   </w:num>
   <w:num w:numId="5" w16cid:durableId="1810783538">
     <w:abstractNumId w:val="6"/>
@@ -3519,46 +3614,46 @@
     <w:abstractNumId w:val="2"/>
   </w:num>
   <w:num w:numId="7" w16cid:durableId="1714576872">
-    <w:abstractNumId w:val="19"/>
+    <w:abstractNumId w:val="20"/>
   </w:num>
   <w:num w:numId="8" w16cid:durableId="244849444">
-    <w:abstractNumId w:val="10"/>
+    <w:abstractNumId w:val="11"/>
   </w:num>
   <w:num w:numId="9" w16cid:durableId="332075654">
-    <w:abstractNumId w:val="16"/>
+    <w:abstractNumId w:val="17"/>
   </w:num>
   <w:num w:numId="10" w16cid:durableId="1889145747">
-    <w:abstractNumId w:val="13"/>
+    <w:abstractNumId w:val="14"/>
   </w:num>
   <w:num w:numId="11" w16cid:durableId="8064644">
     <w:abstractNumId w:val="0"/>
   </w:num>
   <w:num w:numId="12" w16cid:durableId="815342743">
-    <w:abstractNumId w:val="23"/>
+    <w:abstractNumId w:val="24"/>
   </w:num>
   <w:num w:numId="13" w16cid:durableId="1213036091">
-    <w:abstractNumId w:val="10"/>
+    <w:abstractNumId w:val="11"/>
   </w:num>
   <w:num w:numId="14" w16cid:durableId="552814049">
-    <w:abstractNumId w:val="20"/>
+    <w:abstractNumId w:val="21"/>
   </w:num>
   <w:num w:numId="15" w16cid:durableId="2144494586">
-    <w:abstractNumId w:val="7"/>
+    <w:abstractNumId w:val="8"/>
   </w:num>
   <w:num w:numId="16" w16cid:durableId="97526593">
     <w:abstractNumId w:val="4"/>
   </w:num>
   <w:num w:numId="17" w16cid:durableId="1106270254">
-    <w:abstractNumId w:val="14"/>
+    <w:abstractNumId w:val="15"/>
   </w:num>
   <w:num w:numId="18" w16cid:durableId="1476874671">
     <w:abstractNumId w:val="3"/>
   </w:num>
   <w:num w:numId="19" w16cid:durableId="62457766">
-    <w:abstractNumId w:val="12"/>
+    <w:abstractNumId w:val="13"/>
   </w:num>
   <w:num w:numId="20" w16cid:durableId="1531649055">
-    <w:abstractNumId w:val="22"/>
+    <w:abstractNumId w:val="23"/>
   </w:num>
   <w:num w:numId="21" w16cid:durableId="1773430195">
     <w:abstractNumId w:val="1"/>
@@ -3567,16 +3662,19 @@
     <w:abstractNumId w:val="5"/>
   </w:num>
   <w:num w:numId="23" w16cid:durableId="680205055">
-    <w:abstractNumId w:val="17"/>
+    <w:abstractNumId w:val="18"/>
   </w:num>
   <w:num w:numId="24" w16cid:durableId="681585630">
-    <w:abstractNumId w:val="11"/>
+    <w:abstractNumId w:val="12"/>
   </w:num>
   <w:num w:numId="25" w16cid:durableId="702360907">
-    <w:abstractNumId w:val="9"/>
+    <w:abstractNumId w:val="10"/>
   </w:num>
   <w:num w:numId="26" w16cid:durableId="2019230346">
     <w:abstractNumId w:val="5"/>
+  </w:num>
+  <w:num w:numId="27" w16cid:durableId="1327897729">
+    <w:abstractNumId w:val="7"/>
   </w:num>
 </w:numbering>
 </file>
@@ -4248,6 +4346,7 @@
     <w:rsid w:val="00E3698B"/>
     <w:rsid w:val="00F072F0"/>
     <w:rsid w:val="00F329D6"/>
+    <w:rsid w:val="00F36887"/>
     <w:rsid w:val="00F82198"/>
     <w:rsid w:val="00FD26D1"/>
     <w:rsid w:val="00FD666A"/>

</xml_diff>